<commit_message>
Add Exasol Xperts narrative + market/reporting addendums
Pitches an "Exasol for Shopify" mid-market accelerator as an Xperts
programme contribution to Exasol product/engineering. Why + What
framing in the main doc; sourced market and reporting-problem evidence
in two companion addendums.

Extended for-word/convert_to_docx.py with hyperlink support so addendum
URLs render as clickable links; regenerated all docx files.

Co-Authored-By: Claude Opus 4.7 (1M context) <noreply@anthropic.com>
</commit_message>
<xml_diff>
--- a/projects/research-notes/for-word/01-Architecture-Overview.docx
+++ b/projects/research-notes/for-word/01-Architecture-Overview.docx
@@ -11,7 +11,6 @@
       </w:r>
     </w:p>
     <w:p>
-      <w:r/>
       <w:r>
         <w:rPr>
           <w:b/>
@@ -23,7 +22,6 @@
       </w:r>
     </w:p>
     <w:p>
-      <w:r/>
       <w:r>
         <w:rPr>
           <w:b/>
@@ -35,7 +33,6 @@
       </w:r>
     </w:p>
     <w:p>
-      <w:r/>
       <w:r>
         <w:rPr>
           <w:b/>
@@ -65,14 +62,12 @@
       </w:r>
     </w:p>
     <w:p>
-      <w:r/>
       <w:r>
         <w:rPr>
           <w:b/>
         </w:rPr>
         <w:t>Key Numbers:</w:t>
       </w:r>
-      <w:r/>
     </w:p>
     <w:p>
       <w:pPr>
@@ -392,14 +387,12 @@
     </w:tbl>
     <w:p/>
     <w:p>
-      <w:r/>
       <w:r>
         <w:rPr>
           <w:b/>
         </w:rPr>
         <w:t>STG Tables:</w:t>
       </w:r>
-      <w:r/>
     </w:p>
     <w:p>
       <w:pPr>
@@ -725,14 +718,12 @@
     </w:tbl>
     <w:p/>
     <w:p>
-      <w:r/>
       <w:r>
         <w:rPr>
           <w:b/>
         </w:rPr>
         <w:t>Dimension Tables:</w:t>
       </w:r>
-      <w:r/>
     </w:p>
     <w:p>
       <w:pPr>
@@ -791,14 +782,12 @@
       </w:r>
     </w:p>
     <w:p>
-      <w:r/>
       <w:r>
         <w:rPr>
           <w:b/>
         </w:rPr>
         <w:t>Fact Tables:</w:t>
       </w:r>
-      <w:r/>
     </w:p>
     <w:p>
       <w:pPr>
@@ -862,14 +851,12 @@
       </w:r>
     </w:p>
     <w:p>
-      <w:r/>
       <w:r>
         <w:rPr>
           <w:b/>
         </w:rPr>
         <w:t>STG Layer:</w:t>
       </w:r>
-      <w:r/>
     </w:p>
     <w:p>
       <w:pPr>
@@ -904,14 +891,12 @@
       </w:r>
     </w:p>
     <w:p>
-      <w:r/>
       <w:r>
         <w:rPr>
           <w:b/>
         </w:rPr>
         <w:t>DWH Layer:</w:t>
       </w:r>
-      <w:r/>
     </w:p>
     <w:p>
       <w:pPr>
@@ -1072,14 +1057,12 @@
     </w:tbl>
     <w:p/>
     <w:p>
-      <w:r/>
       <w:r>
         <w:rPr>
           <w:b/>
         </w:rPr>
         <w:t>Benefits:</w:t>
       </w:r>
-      <w:r/>
     </w:p>
     <w:p>
       <w:pPr>
@@ -1139,14 +1122,12 @@
       </w:r>
     </w:p>
     <w:p>
-      <w:r/>
       <w:r>
         <w:rPr>
           <w:b/>
         </w:rPr>
         <w:t>Benefits:</w:t>
       </w:r>
-      <w:r/>
     </w:p>
     <w:p>
       <w:pPr>
@@ -2098,7 +2079,6 @@
       <w:pPr>
         <w:pStyle w:val="ListNumber"/>
       </w:pPr>
-      <w:r/>
       <w:r>
         <w:rPr>
           <w:b/>
@@ -2113,7 +2093,6 @@
       <w:pPr>
         <w:pStyle w:val="ListNumber"/>
       </w:pPr>
-      <w:r/>
       <w:r>
         <w:rPr>
           <w:b/>
@@ -2128,7 +2107,6 @@
       <w:pPr>
         <w:pStyle w:val="ListNumber"/>
       </w:pPr>
-      <w:r/>
       <w:r>
         <w:rPr>
           <w:b/>
@@ -2143,7 +2121,6 @@
       <w:pPr>
         <w:pStyle w:val="ListNumber"/>
       </w:pPr>
-      <w:r/>
       <w:r>
         <w:rPr>
           <w:b/>
@@ -2158,7 +2135,6 @@
       <w:pPr>
         <w:pStyle w:val="ListNumber"/>
       </w:pPr>
-      <w:r/>
       <w:r>
         <w:rPr>
           <w:b/>

</xml_diff>